<commit_message>
feat(thang): save Review 2 ERD, State Machines, Live Session and Hub enhancements
</commit_message>
<xml_diff>
--- a/docs/specification/FA26SE032_SCANMS_SALES_COLLABORATOR_AFFILIATE_NETWORK_MANAGEMENT_ASS_MINHTTH5_real.docx
+++ b/docs/specification/FA26SE032_SCANMS_SALES_COLLABORATOR_AFFILIATE_NETWORK_MANAGEMENT_ASS_MINHTTH5_real.docx
@@ -141,14 +141,11 @@
       </w:pPr>
       <w:r>
         <w:rPr>
-          <w:rFonts w:ascii="Times New Roman" w:eastAsia="Times New Roman" w:hAnsi="Times New Roman" w:cs="Times New Roman"/>
+          <w:rFonts w:ascii="Times New Roman" w:hAnsi="Times New Roman" w:cs="Times New Roman" w:eastAsia="Times New Roman"/>
           <w:b/>
-          <w:bCs/>
-          <w:sz w:val="24"/>
-          <w:szCs w:val="24"/>
-          <w:lang w:val="en-US"/>
-        </w:rPr>
-        <w:t>Class:            Duration time:  from 01/01/2026 To 30/04/2026</w:t>
+          <w:sz w:val="24"/>
+        </w:rPr>
+        <w:t>Class:            Duration time:  from 07/09/2026 To 30/12/2026</w:t>
       </w:r>
     </w:p>
     <w:p>
@@ -1780,12 +1777,10 @@
             </w:pPr>
             <w:r>
               <w:rPr>
-                <w:rFonts w:ascii="Times New Roman" w:eastAsia="Times New Roman" w:hAnsi="Times New Roman" w:cs="Times New Roman"/>
-                <w:sz w:val="24"/>
-                <w:szCs w:val="24"/>
-                <w:lang w:val="en-US"/>
-              </w:rPr>
-              <w:t>SE180104</w:t>
+                <w:rFonts w:ascii="Times New Roman" w:hAnsi="Times New Roman" w:cs="Times New Roman" w:eastAsia="Times New Roman"/>
+                <w:sz w:val="24"/>
+              </w:rPr>
+              <w:t>SE182540</w:t>
             </w:r>
           </w:p>
         </w:tc>
@@ -2370,239 +2365,6 @@
           </w:p>
         </w:tc>
       </w:tr>
-      <w:tr>
-        <w:trPr>
-          <w:trHeight w:val="750"/>
-        </w:trPr>
-        <w:tc>
-          <w:tcPr>
-            <w:tcW w:w="555" w:type="dxa"/>
-            <w:tcBorders>
-              <w:top w:val="single" w:sz="6" w:space="0" w:color="808080"/>
-              <w:left w:val="single" w:sz="6" w:space="0" w:color="000000"/>
-              <w:bottom w:val="single" w:sz="6" w:space="0" w:color="000000"/>
-              <w:right w:val="single" w:sz="6" w:space="0" w:color="000000"/>
-            </w:tcBorders>
-            <w:tcMar>
-              <w:top w:w="0" w:type="dxa"/>
-              <w:left w:w="0" w:type="dxa"/>
-              <w:bottom w:w="0" w:type="dxa"/>
-              <w:right w:w="0" w:type="dxa"/>
-            </w:tcMar>
-            <w:vAlign w:val="center"/>
-          </w:tcPr>
-          <w:p>
-            <w:pPr>
-              <w:spacing w:before="40" w:after="40"/>
-              <w:ind w:left="-80"/>
-              <w:jc w:val="center"/>
-              <w:rPr>
-                <w:rFonts w:ascii="Times New Roman" w:eastAsia="Times New Roman" w:hAnsi="Times New Roman" w:cs="Times New Roman"/>
-                <w:sz w:val="24"/>
-                <w:szCs w:val="24"/>
-              </w:rPr>
-            </w:pPr>
-          </w:p>
-        </w:tc>
-        <w:tc>
-          <w:tcPr>
-            <w:tcW w:w="2490" w:type="dxa"/>
-            <w:tcBorders>
-              <w:top w:val="single" w:sz="6" w:space="0" w:color="808080"/>
-              <w:left w:val="single" w:sz="6" w:space="0" w:color="808080"/>
-              <w:bottom w:val="single" w:sz="6" w:space="0" w:color="000000"/>
-              <w:right w:val="single" w:sz="6" w:space="0" w:color="000000"/>
-            </w:tcBorders>
-            <w:tcMar>
-              <w:top w:w="0" w:type="dxa"/>
-              <w:left w:w="0" w:type="dxa"/>
-              <w:bottom w:w="0" w:type="dxa"/>
-              <w:right w:w="0" w:type="dxa"/>
-            </w:tcMar>
-            <w:vAlign w:val="center"/>
-          </w:tcPr>
-          <w:p>
-            <w:pPr>
-              <w:spacing w:before="40" w:after="40"/>
-              <w:ind w:left="-80"/>
-              <w:jc w:val="center"/>
-              <w:rPr>
-                <w:rFonts w:ascii="Times New Roman" w:eastAsia="Times New Roman" w:hAnsi="Times New Roman" w:cs="Times New Roman"/>
-                <w:sz w:val="24"/>
-                <w:szCs w:val="24"/>
-              </w:rPr>
-            </w:pPr>
-            <w:r>
-              <w:rPr>
-                <w:rFonts w:ascii="Times New Roman" w:hAnsi="Times New Roman" w:cs="Times New Roman"/>
-                <w:color w:val="081B3A"/>
-                <w:spacing w:val="3"/>
-                <w:sz w:val="24"/>
-                <w:szCs w:val="24"/>
-                <w:shd w:val="clear" w:color="auto" w:fill="FFFFFF"/>
-              </w:rPr>
-              <w:t>Trần Văn Nhật</w:t>
-            </w:r>
-          </w:p>
-        </w:tc>
-        <w:tc>
-          <w:tcPr>
-            <w:tcW w:w="1230" w:type="dxa"/>
-            <w:tcBorders>
-              <w:top w:val="single" w:sz="6" w:space="0" w:color="808080"/>
-              <w:left w:val="single" w:sz="6" w:space="0" w:color="808080"/>
-              <w:bottom w:val="single" w:sz="6" w:space="0" w:color="000000"/>
-              <w:right w:val="single" w:sz="6" w:space="0" w:color="000000"/>
-            </w:tcBorders>
-            <w:tcMar>
-              <w:top w:w="0" w:type="dxa"/>
-              <w:left w:w="0" w:type="dxa"/>
-              <w:bottom w:w="0" w:type="dxa"/>
-              <w:right w:w="0" w:type="dxa"/>
-            </w:tcMar>
-            <w:vAlign w:val="center"/>
-          </w:tcPr>
-          <w:p>
-            <w:pPr>
-              <w:spacing w:before="40" w:after="40"/>
-              <w:ind w:left="-80"/>
-              <w:jc w:val="center"/>
-              <w:rPr>
-                <w:rFonts w:ascii="Times New Roman" w:eastAsia="Times New Roman" w:hAnsi="Times New Roman" w:cs="Times New Roman"/>
-                <w:sz w:val="24"/>
-                <w:szCs w:val="24"/>
-              </w:rPr>
-            </w:pPr>
-            <w:r>
-              <w:rPr>
-                <w:rFonts w:ascii="Times New Roman" w:eastAsia="Times New Roman" w:hAnsi="Times New Roman" w:cs="Times New Roman"/>
-                <w:sz w:val="24"/>
-                <w:szCs w:val="24"/>
-              </w:rPr>
-              <w:t>SE172768</w:t>
-            </w:r>
-          </w:p>
-        </w:tc>
-        <w:tc>
-          <w:tcPr>
-            <w:tcW w:w="1410" w:type="dxa"/>
-            <w:tcBorders>
-              <w:top w:val="single" w:sz="6" w:space="0" w:color="808080"/>
-              <w:left w:val="single" w:sz="6" w:space="0" w:color="808080"/>
-              <w:bottom w:val="single" w:sz="6" w:space="0" w:color="000000"/>
-              <w:right w:val="single" w:sz="6" w:space="0" w:color="000000"/>
-            </w:tcBorders>
-            <w:tcMar>
-              <w:top w:w="0" w:type="dxa"/>
-              <w:left w:w="0" w:type="dxa"/>
-              <w:bottom w:w="0" w:type="dxa"/>
-              <w:right w:w="0" w:type="dxa"/>
-            </w:tcMar>
-            <w:vAlign w:val="center"/>
-          </w:tcPr>
-          <w:p>
-            <w:pPr>
-              <w:spacing w:before="40" w:after="40"/>
-              <w:ind w:left="-80"/>
-              <w:jc w:val="center"/>
-              <w:rPr>
-                <w:rFonts w:ascii="Times New Roman" w:eastAsia="Times New Roman" w:hAnsi="Times New Roman" w:cs="Times New Roman"/>
-                <w:sz w:val="24"/>
-                <w:szCs w:val="24"/>
-              </w:rPr>
-            </w:pPr>
-            <w:r>
-              <w:rPr>
-                <w:rFonts w:ascii="Times New Roman" w:eastAsia="Times New Roman" w:hAnsi="Times New Roman" w:cs="Times New Roman"/>
-                <w:sz w:val="24"/>
-                <w:szCs w:val="24"/>
-              </w:rPr>
-              <w:t>0949997692</w:t>
-            </w:r>
-          </w:p>
-        </w:tc>
-        <w:tc>
-          <w:tcPr>
-            <w:tcW w:w="3015" w:type="dxa"/>
-            <w:tcBorders>
-              <w:top w:val="single" w:sz="6" w:space="0" w:color="808080"/>
-              <w:left w:val="single" w:sz="6" w:space="0" w:color="808080"/>
-              <w:bottom w:val="single" w:sz="6" w:space="0" w:color="000000"/>
-              <w:right w:val="single" w:sz="6" w:space="0" w:color="000000"/>
-            </w:tcBorders>
-            <w:tcMar>
-              <w:top w:w="0" w:type="dxa"/>
-              <w:left w:w="0" w:type="dxa"/>
-              <w:bottom w:w="0" w:type="dxa"/>
-              <w:right w:w="0" w:type="dxa"/>
-            </w:tcMar>
-            <w:vAlign w:val="center"/>
-          </w:tcPr>
-          <w:p>
-            <w:pPr>
-              <w:spacing w:before="40" w:after="40"/>
-              <w:ind w:left="-80"/>
-              <w:jc w:val="center"/>
-              <w:rPr>
-                <w:rFonts w:ascii="Times New Roman" w:eastAsia="Times New Roman" w:hAnsi="Times New Roman" w:cs="Times New Roman"/>
-                <w:color w:val="3333FF"/>
-                <w:sz w:val="24"/>
-                <w:szCs w:val="24"/>
-              </w:rPr>
-            </w:pPr>
-            <w:r>
-              <w:rPr>
-                <w:rFonts w:ascii="Times New Roman" w:eastAsia="Times New Roman" w:hAnsi="Times New Roman" w:cs="Times New Roman"/>
-                <w:color w:val="3333FF"/>
-                <w:sz w:val="24"/>
-                <w:szCs w:val="24"/>
-              </w:rPr>
-              <w:t>NhatTVSE172768@fpt.efu.vn</w:t>
-            </w:r>
-          </w:p>
-        </w:tc>
-        <w:tc>
-          <w:tcPr>
-            <w:tcW w:w="1485" w:type="dxa"/>
-            <w:tcBorders>
-              <w:top w:val="single" w:sz="6" w:space="0" w:color="808080"/>
-              <w:left w:val="single" w:sz="6" w:space="0" w:color="808080"/>
-              <w:bottom w:val="single" w:sz="6" w:space="0" w:color="000000"/>
-              <w:right w:val="single" w:sz="6" w:space="0" w:color="000000"/>
-            </w:tcBorders>
-            <w:tcMar>
-              <w:top w:w="0" w:type="dxa"/>
-              <w:left w:w="0" w:type="dxa"/>
-              <w:bottom w:w="0" w:type="dxa"/>
-              <w:right w:w="0" w:type="dxa"/>
-            </w:tcMar>
-            <w:vAlign w:val="center"/>
-          </w:tcPr>
-          <w:p>
-            <w:pPr>
-              <w:spacing w:before="40" w:after="40"/>
-              <w:ind w:left="-80"/>
-              <w:jc w:val="center"/>
-              <w:rPr>
-                <w:rFonts w:ascii="Times New Roman" w:eastAsia="Times New Roman" w:hAnsi="Times New Roman" w:cs="Times New Roman"/>
-                <w:sz w:val="24"/>
-                <w:szCs w:val="24"/>
-                <w:lang w:val="vi-VN"/>
-              </w:rPr>
-            </w:pPr>
-            <w:r>
-              <w:rPr>
-                <w:rFonts w:ascii="Times New Roman" w:eastAsia="Times New Roman" w:hAnsi="Times New Roman" w:cs="Times New Roman"/>
-                <w:color w:val="3333FF"/>
-                <w:sz w:val="24"/>
-                <w:szCs w:val="24"/>
-                <w:lang w:val="vi-VN"/>
-              </w:rPr>
-              <w:t>Member</w:t>
-            </w:r>
-          </w:p>
-        </w:tc>
-      </w:tr>
     </w:tbl>
     <w:p>
       <w:pPr>
@@ -2774,73 +2536,32 @@
       </w:pPr>
       <w:r>
         <w:rPr>
-          <w:rFonts w:ascii="Times New Roman" w:eastAsia="Times New Roman" w:hAnsi="Times New Roman" w:cs="Times New Roman"/>
-        </w:rPr>
-        <w:lastRenderedPageBreak/>
-        <w:t>Direct-to-consumer (D2C) and social commerce models are experiencing exponential growth in Vietnam. E-commerce platforms and online brands increasingly rely on a distributed network of sales collaborators (KOLs, KOCs, and affiliates) for product distribution. However, managing these networks manually introduces critical operational and business risks:</w:t>
-      </w:r>
-      <w:r>
-        <w:rPr>
-          <w:rFonts w:ascii="Times New Roman" w:eastAsia="Times New Roman" w:hAnsi="Times New Roman" w:cs="Times New Roman"/>
-        </w:rPr>
+          <w:rFonts w:ascii="Times New Roman" w:hAnsi="Times New Roman" w:cs="Times New Roman" w:eastAsia="Times New Roman"/>
+          <w:sz w:val="24"/>
+        </w:rPr>
+        <w:t>Direct-to-consumer (D2C) and social commerce models are experiencing exponential growth in Vietnam, driven by platforms like TikTok Shop and Shopee. Brands and retail merchants increasingly depend on distributed creator networks (KOLs, KOCs, and publishers) to drive product discovery and sales conversion. However, managing multi-merchant affiliate networks manually introduces critical operational, business, and security risks:</w:t>
         <w:br/>
         <w:t>●</w:t>
-      </w:r>
-      <w:r>
-        <w:rPr>
-          <w:rFonts w:ascii="Times New Roman" w:eastAsia="Times New Roman" w:hAnsi="Times New Roman" w:cs="Times New Roman"/>
-        </w:rPr>
         <w:tab/>
-        <w:t>Financial discrepancies: Manual calculation of multi-tiered commission schemes (per-product, volume-based, or multi-level referral rates) leads to errors, settlement delays, and collaborator trust issues.</w:t>
-      </w:r>
-      <w:r>
-        <w:rPr>
-          <w:rFonts w:ascii="Times New Roman" w:eastAsia="Times New Roman" w:hAnsi="Times New Roman" w:cs="Times New Roman"/>
-        </w:rPr>
+        <w:t>Financial discrepancies &amp; settlement delays: Manual calculation of multi-tiered commission schemes across disparate product categories leads to calculation errors, settlement delays, and collaborator trust erosion.</w:t>
         <w:br/>
         <w:t>●</w:t>
-      </w:r>
-      <w:r>
-        <w:rPr>
-          <w:rFonts w:ascii="Times New Roman" w:eastAsia="Times New Roman" w:hAnsi="Times New Roman" w:cs="Times New Roman"/>
-        </w:rPr>
         <w:tab/>
-        <w:t>Performance bottlenecks: Collaborators lack real-time visual dashboards (tracking clicks, conversion rates, order statuses) to optimize their marketing campaigns, while shop managers lack data to identify high-performing partners.</w:t>
-      </w:r>
-      <w:r>
-        <w:rPr>
-          <w:rFonts w:ascii="Times New Roman" w:eastAsia="Times New Roman" w:hAnsi="Times New Roman" w:cs="Times New Roman"/>
-        </w:rPr>
+        <w:t>Attribution vulnerabilities &amp; traffic fraud: Lack of robust tracking mechanisms leads to attribution disputes, cookie hijacking, and bot-driven click farming that drains merchant marketing budgets without yielding genuine sales.</w:t>
         <w:br/>
         <w:t>●</w:t>
-      </w:r>
-      <w:r>
-        <w:rPr>
-          <w:rFonts w:ascii="Times New Roman" w:eastAsia="Times New Roman" w:hAnsi="Times New Roman" w:cs="Times New Roman"/>
-        </w:rPr>
         <w:tab/>
-        <w:t>Resource fragmentation &amp; data leakage: Promotional materials, image assets, and product descriptions are scattered across various chat groups (Zalo, Telegram), leading to inconsistent brand messaging. Customer lists linked to collaborators are prone to duplication or leakage.</w:t>
-      </w:r>
-      <w:r>
-        <w:rPr>
-          <w:rFonts w:ascii="Times New Roman" w:eastAsia="Times New Roman" w:hAnsi="Times New Roman" w:cs="Times New Roman"/>
-        </w:rPr>
+        <w:t>Reverse logistics &amp; commission overpayment: Without an integrated escrow holding mechanism, merchants routinely pay out commissions for orders that are subsequently cancelled, returned, or refunded by buyers.</w:t>
         <w:br/>
         <w:t>●</w:t>
-      </w:r>
-      <w:r>
-        <w:rPr>
-          <w:rFonts w:ascii="Times New Roman" w:eastAsia="Times New Roman" w:hAnsi="Times New Roman" w:cs="Times New Roman"/>
-        </w:rPr>
         <w:tab/>
-        <w:t>Inventory misalignment: Collaborators sell out-of-stock items due to the lack of real-time inventory synchronization.</w:t>
-      </w:r>
-      <w:r>
-        <w:rPr>
-          <w:rFonts w:ascii="Times New Roman" w:eastAsia="Times New Roman" w:hAnsi="Times New Roman" w:cs="Times New Roman"/>
-        </w:rPr>
+        <w:t>Operational fragmentation &amp; sample mismanagement: Promotional materials, image assets, and review scripts are scattered across personal messaging groups (Zalo, Telegram). Furthermore, distributing physical sample products to creators lacks structured accountability, delivery tracking, and content proof verification.</w:t>
         <w:br/>
-        <w:t>Therefore, a unified digital platform that automates the entire collaborator lifecycle—from onboarding, marketing asset distribution, referral tracking, to automated commission reconciliation and secure payouts—is vital for business scaling.</w:t>
+        <w:t>●</w:t>
+        <w:tab/>
+        <w:t>Absence of unified marketplace multi-tenancy: Traditional affiliate plugins cater only to single stores rather than an enterprise multi-merchant marketplace that balances the interests of Merchants, Content Creators, Customers, and Platform Regulators.</w:t>
+        <w:br/>
+        <w:t>Therefore, building a unified digital platform that automates the entire collaborator lifecycle—from onboarding, marketing asset distribution, referral tracking, to automated escrow reconciliation, creator sample fulfillment, and secure payouts—is vital for business scaling.</w:t>
       </w:r>
     </w:p>
     <w:p>
@@ -2881,281 +2602,97 @@
       </w:pPr>
       <w:r>
         <w:rPr>
-          <w:rFonts w:ascii="Times New Roman" w:eastAsia="Times New Roman" w:hAnsi="Times New Roman" w:cs="Times New Roman"/>
-        </w:rPr>
-        <w:t>The proposed system is an enterprise-grade Web Portal solution designed to streamline revenue-sharing models and optimize the performance of online sales collaborator networks.</w:t>
-      </w:r>
-      <w:r>
-        <w:rPr>
-          <w:rFonts w:ascii="Times New Roman" w:eastAsia="Times New Roman" w:hAnsi="Times New Roman" w:cs="Times New Roman"/>
-        </w:rPr>
+          <w:rFonts w:ascii="Times New Roman" w:hAnsi="Times New Roman" w:cs="Times New Roman" w:eastAsia="Times New Roman"/>
+          <w:sz w:val="24"/>
+        </w:rPr>
+        <w:t>The proposed system is an enterprise-grade Web Portal solution designed to streamline revenue-sharing models and optimize the performance of online sales collaborator networks across a multi-merchant architecture.</w:t>
         <w:br/>
-      </w:r>
-      <w:r>
-        <w:rPr>
-          <w:rFonts w:ascii="Times New Roman" w:eastAsia="Times New Roman" w:hAnsi="Times New Roman" w:cs="Times New Roman"/>
-        </w:rPr>
         <w:br/>
         <w:t>Core Features:</w:t>
-      </w:r>
-      <w:r>
-        <w:rPr>
-          <w:rFonts w:ascii="Times New Roman" w:eastAsia="Times New Roman" w:hAnsi="Times New Roman" w:cs="Times New Roman"/>
-        </w:rPr>
         <w:br/>
         <w:t>1.</w:t>
-      </w:r>
-      <w:r>
-        <w:rPr>
-          <w:rFonts w:ascii="Times New Roman" w:eastAsia="Times New Roman" w:hAnsi="Times New Roman" w:cs="Times New Roman"/>
-        </w:rPr>
         <w:tab/>
         <w:t>User Identity &amp; Access Management (IAM):</w:t>
-      </w:r>
-      <w:r>
-        <w:rPr>
-          <w:rFonts w:ascii="Times New Roman" w:eastAsia="Times New Roman" w:hAnsi="Times New Roman" w:cs="Times New Roman"/>
-        </w:rPr>
         <w:br/>
         <w:t>○</w:t>
-      </w:r>
-      <w:r>
-        <w:rPr>
-          <w:rFonts w:ascii="Times New Roman" w:eastAsia="Times New Roman" w:hAnsi="Times New Roman" w:cs="Times New Roman"/>
-        </w:rPr>
         <w:tab/>
-        <w:t>Strict role-based access control (RBAC) with three main roles: System Administrator, Shop Manager, and Collaborator.</w:t>
-      </w:r>
-      <w:r>
-        <w:rPr>
-          <w:rFonts w:ascii="Times New Roman" w:eastAsia="Times New Roman" w:hAnsi="Times New Roman" w:cs="Times New Roman"/>
-        </w:rPr>
+        <w:t>Strict role-based access control (RBAC) with five core roles: System Administrator, System Manager (Platform Moderator &amp; Dispute Arbitrator), Shop Manager, Collaborator (KOL/KOC), and Customer.</w:t>
         <w:br/>
         <w:t>○</w:t>
-      </w:r>
-      <w:r>
-        <w:rPr>
-          <w:rFonts w:ascii="Times New Roman" w:eastAsia="Times New Roman" w:hAnsi="Times New Roman" w:cs="Times New Roman"/>
-        </w:rPr>
         <w:tab/>
-        <w:t>Structured onboarding flows for verifying identity documents, tax information, and banking credentials for legal payout processing.</w:t>
-      </w:r>
-      <w:r>
-        <w:rPr>
-          <w:rFonts w:ascii="Times New Roman" w:eastAsia="Times New Roman" w:hAnsi="Times New Roman" w:cs="Times New Roman"/>
-        </w:rPr>
+        <w:t>Structured onboarding flows for verifying identity documents (e-KYC), tax information, and banking credentials for legal payout processing and merchant verification.</w:t>
         <w:br/>
         <w:t>2.</w:t>
-      </w:r>
-      <w:r>
-        <w:rPr>
-          <w:rFonts w:ascii="Times New Roman" w:eastAsia="Times New Roman" w:hAnsi="Times New Roman" w:cs="Times New Roman"/>
-        </w:rPr>
         <w:tab/>
-        <w:t>Attribution &amp; Tracking Engine:</w:t>
-      </w:r>
-      <w:r>
-        <w:rPr>
-          <w:rFonts w:ascii="Times New Roman" w:eastAsia="Times New Roman" w:hAnsi="Times New Roman" w:cs="Times New Roman"/>
-        </w:rPr>
+        <w:t>Multi-Tier Product Catalog &amp; Logistics Integration:</w:t>
         <w:br/>
         <w:t>○</w:t>
-      </w:r>
-      <w:r>
-        <w:rPr>
-          <w:rFonts w:ascii="Times New Roman" w:eastAsia="Times New Roman" w:hAnsi="Times New Roman" w:cs="Times New Roman"/>
-        </w:rPr>
         <w:tab/>
-        <w:t>Automated generation of encrypted affiliate links, custom promo coupon codes, and dynamic QR codes.</w:t>
-      </w:r>
-      <w:r>
-        <w:rPr>
-          <w:rFonts w:ascii="Times New Roman" w:eastAsia="Times New Roman" w:hAnsi="Times New Roman" w:cs="Times New Roman"/>
-        </w:rPr>
+        <w:t>Standard e-commerce catalog supporting a multi-tier variant matrix (Color x Size), sub-SKU inventory, and physical shipping dimensions integrated with carrier logistics APIs.</w:t>
         <w:br/>
         <w:t>○</w:t>
-      </w:r>
-      <w:r>
-        <w:rPr>
-          <w:rFonts w:ascii="Times New Roman" w:eastAsia="Times New Roman" w:hAnsi="Times New Roman" w:cs="Times New Roman"/>
-        </w:rPr>
         <w:tab/>
-        <w:t>Implementation of browser cookie tracking and device fingerprinting to guarantee accurate sales attribution, persisting across a configurable attribution window.</w:t>
-      </w:r>
-      <w:r>
-        <w:rPr>
-          <w:rFonts w:ascii="Times New Roman" w:eastAsia="Times New Roman" w:hAnsi="Times New Roman" w:cs="Times New Roman"/>
-        </w:rPr>
+        <w:t>Strict Customer Authentication (eliminating anonymous guest checkout) to ensure order provenance, address book persistence, and warranty/dispute tracking.</w:t>
         <w:br/>
         <w:t>3.</w:t>
-      </w:r>
-      <w:r>
-        <w:rPr>
-          <w:rFonts w:ascii="Times New Roman" w:eastAsia="Times New Roman" w:hAnsi="Times New Roman" w:cs="Times New Roman"/>
-        </w:rPr>
         <w:tab/>
-        <w:t>Automated Commission Configuration &amp; Billing Engine:</w:t>
-      </w:r>
-      <w:r>
-        <w:rPr>
-          <w:rFonts w:ascii="Times New Roman" w:eastAsia="Times New Roman" w:hAnsi="Times New Roman" w:cs="Times New Roman"/>
-        </w:rPr>
+        <w:t>Attribution, Dynamic Referral &amp; Anti-Fraud Engine:</w:t>
         <w:br/>
         <w:t>○</w:t>
-      </w:r>
-      <w:r>
-        <w:rPr>
-          <w:rFonts w:ascii="Times New Roman" w:eastAsia="Times New Roman" w:hAnsi="Times New Roman" w:cs="Times New Roman"/>
-        </w:rPr>
+        <w:tab/>
+        <w:t>Automated generation of encrypted affiliate links, custom promo coupon codes, and dynamic QR codes associated with collaborator IDs.</w:t>
+        <w:br/>
+        <w:t>○</w:t>
+        <w:tab/>
+        <w:t>Last-Click attribution engine combining encrypted cookies with Redis-backed in-memory rate limiting to thwart click-spam and bot traffic.</w:t>
+        <w:br/>
+        <w:t>4.</w:t>
+        <w:tab/>
+        <w:t>Automated Commission Configuration, Escrow &amp; Reverse Logistics:</w:t>
+        <w:br/>
+        <w:t>○</w:t>
         <w:tab/>
         <w:t>Flexible commission rules: flat rates per product, percentage-based commissions, or performance-tiered commission rates based on monthly sales targets.</w:t>
-      </w:r>
-      <w:r>
-        <w:rPr>
-          <w:rFonts w:ascii="Times New Roman" w:eastAsia="Times New Roman" w:hAnsi="Times New Roman" w:cs="Times New Roman"/>
-        </w:rPr>
         <w:br/>
         <w:t>○</w:t>
-      </w:r>
-      <w:r>
-        <w:rPr>
-          <w:rFonts w:ascii="Times New Roman" w:eastAsia="Times New Roman" w:hAnsi="Times New Roman" w:cs="Times New Roman"/>
-        </w:rPr>
         <w:tab/>
-        <w:t>A financial transaction ledger tracking commission states: Pending, Approved (upon order completion and refund period expiration), and Reversed (due to returns or cancellations).</w:t>
-      </w:r>
-      <w:r>
-        <w:rPr>
-          <w:rFonts w:ascii="Times New Roman" w:eastAsia="Times New Roman" w:hAnsi="Times New Roman" w:cs="Times New Roman"/>
-        </w:rPr>
+        <w:t>A financial transaction ledger with an automated escrow holding period matching customer return windows (Pending -&gt; Approved upon return window expiration, or Reversed/Clawback due to returns/cancellations).</w:t>
         <w:br/>
-        <w:t>4.</w:t>
-      </w:r>
-      <w:r>
-        <w:rPr>
-          <w:rFonts w:ascii="Times New Roman" w:eastAsia="Times New Roman" w:hAnsi="Times New Roman" w:cs="Times New Roman"/>
-        </w:rPr>
+        <w:t>5.</w:t>
         <w:tab/>
-        <w:t>Collaborator Portal (Responsive Web Interface):</w:t>
-      </w:r>
-      <w:r>
-        <w:rPr>
-          <w:rFonts w:ascii="Times New Roman" w:eastAsia="Times New Roman" w:hAnsi="Times New Roman" w:cs="Times New Roman"/>
-        </w:rPr>
+        <w:t>Interactive Collaboration, Sample Fulfillment &amp; Live Commerce:</w:t>
         <w:br/>
         <w:t>○</w:t>
-      </w:r>
-      <w:r>
-        <w:rPr>
-          <w:rFonts w:ascii="Times New Roman" w:eastAsia="Times New Roman" w:hAnsi="Times New Roman" w:cs="Times New Roman"/>
-        </w:rPr>
         <w:tab/>
-        <w:t xml:space="preserve">Real-time analytics dashboard presenting clicks, successful orders, conversion </w:t>
-      </w:r>
-      <w:r>
-        <w:rPr>
-          <w:rFonts w:ascii="Times New Roman" w:eastAsia="Times New Roman" w:hAnsi="Times New Roman" w:cs="Times New Roman"/>
-        </w:rPr>
-        <w:lastRenderedPageBreak/>
-        <w:t>rates (CR), pending commissions, and withdrawable balance.</w:t>
-      </w:r>
-      <w:r>
-        <w:rPr>
-          <w:rFonts w:ascii="Times New Roman" w:eastAsia="Times New Roman" w:hAnsi="Times New Roman" w:cs="Times New Roman"/>
-        </w:rPr>
+        <w:t>Integrated real-time messaging enabling direct Merchant–KOL communication and exclusive campaign deal negotiations.</w:t>
         <w:br/>
         <w:t>○</w:t>
-      </w:r>
-      <w:r>
-        <w:rPr>
-          <w:rFonts w:ascii="Times New Roman" w:eastAsia="Times New Roman" w:hAnsi="Times New Roman" w:cs="Times New Roman"/>
-        </w:rPr>
         <w:tab/>
-        <w:t>Centralized digital media library for collaborators to download product photos, videos, and SEO-optimized copy for marketing.</w:t>
-      </w:r>
-      <w:r>
-        <w:rPr>
-          <w:rFonts w:ascii="Times New Roman" w:eastAsia="Times New Roman" w:hAnsi="Times New Roman" w:cs="Times New Roman"/>
-        </w:rPr>
+        <w:t>Structured Sample Request workflow (Request -&gt; Approval -&gt; Waybill Tracking -&gt; Video Review Proof -&gt; Completion) and Live Commerce session deal pinning.</w:t>
         <w:br/>
-        <w:t>5.</w:t>
-      </w:r>
-      <w:r>
-        <w:rPr>
-          <w:rFonts w:ascii="Times New Roman" w:eastAsia="Times New Roman" w:hAnsi="Times New Roman" w:cs="Times New Roman"/>
-        </w:rPr>
+        <w:t>6.</w:t>
         <w:tab/>
-        <w:t>Payout &amp; Settlement Module:</w:t>
-      </w:r>
-      <w:r>
-        <w:rPr>
-          <w:rFonts w:ascii="Times New Roman" w:eastAsia="Times New Roman" w:hAnsi="Times New Roman" w:cs="Times New Roman"/>
-        </w:rPr>
+        <w:t>Dual AI Engines &amp; Enterprise Management Dashboard:</w:t>
         <w:br/>
         <w:t>○</w:t>
-      </w:r>
-      <w:r>
-        <w:rPr>
-          <w:rFonts w:ascii="Times New Roman" w:eastAsia="Times New Roman" w:hAnsi="Times New Roman" w:cs="Times New Roman"/>
-        </w:rPr>
         <w:tab/>
-        <w:t>Automated payout requests once the balance exceeds a minimum threshold.</w:t>
-      </w:r>
-      <w:r>
-        <w:rPr>
-          <w:rFonts w:ascii="Times New Roman" w:eastAsia="Times New Roman" w:hAnsi="Times New Roman" w:cs="Times New Roman"/>
-        </w:rPr>
+        <w:t>AI Smart Matching recommending optimal KOL partners to merchants based on product category synergy and historical performance; AI Anti-Fraud detecting suspicious traffic patterns.</w:t>
         <w:br/>
         <w:t>○</w:t>
-      </w:r>
-      <w:r>
-        <w:rPr>
-          <w:rFonts w:ascii="Times New Roman" w:eastAsia="Times New Roman" w:hAnsi="Times New Roman" w:cs="Times New Roman"/>
-        </w:rPr>
         <w:tab/>
-        <w:t>Manager-side audit workflows, automated invoice generation, and bank transfer reconciliation to prevent cashflow leakages.</w:t>
-      </w:r>
-      <w:r>
-        <w:rPr>
-          <w:rFonts w:ascii="Times New Roman" w:eastAsia="Times New Roman" w:hAnsi="Times New Roman" w:cs="Times New Roman"/>
-        </w:rPr>
+        <w:t>Real-time analytics dashboard presenting clicks, successful orders, conversion rates (CR), pending commissions, withdrawable balance, and collaborator leaderboards.</w:t>
         <w:br/>
-        <w:t>6.</w:t>
-      </w:r>
-      <w:r>
-        <w:rPr>
-          <w:rFonts w:ascii="Times New Roman" w:eastAsia="Times New Roman" w:hAnsi="Times New Roman" w:cs="Times New Roman"/>
-        </w:rPr>
+        <w:t>7.</w:t>
         <w:tab/>
-        <w:t>Enterprise Management Dashboard (Admin &amp; Manager Portal):</w:t>
-      </w:r>
-      <w:r>
-        <w:rPr>
-          <w:rFonts w:ascii="Times New Roman" w:eastAsia="Times New Roman" w:hAnsi="Times New Roman" w:cs="Times New Roman"/>
-        </w:rPr>
+        <w:t>Concurrency-Safe Payout &amp; Tax Compliance:</w:t>
         <w:br/>
         <w:t>○</w:t>
-      </w:r>
-      <w:r>
-        <w:rPr>
-          <w:rFonts w:ascii="Times New Roman" w:eastAsia="Times New Roman" w:hAnsi="Times New Roman" w:cs="Times New Roman"/>
-        </w:rPr>
         <w:tab/>
-        <w:t>Real-time leaderboard ranking collaborators by revenue contribution.</w:t>
-      </w:r>
-      <w:r>
-        <w:rPr>
-          <w:rFonts w:ascii="Times New Roman" w:eastAsia="Times New Roman" w:hAnsi="Times New Roman" w:cs="Times New Roman"/>
-        </w:rPr>
+        <w:t>Automated payout requests with database row-level locking to eliminate double-spending race conditions.</w:t>
         <w:br/>
         <w:t>○</w:t>
-      </w:r>
-      <w:r>
-        <w:rPr>
-          <w:rFonts w:ascii="Times New Roman" w:eastAsia="Times New Roman" w:hAnsi="Times New Roman" w:cs="Times New Roman"/>
-        </w:rPr>
         <w:tab/>
-        <w:t>Analytics reports showing store sales performance, commission expenses, and return rates.</w:t>
+        <w:t>Automated statutory Personal Income Tax (PIT) withholding on qualifying withdrawals, manager audit trails, and automated batch disbursement export.</w:t>
       </w:r>
     </w:p>
     <w:p>
@@ -3196,240 +2733,94 @@
       </w:pPr>
       <w:r>
         <w:rPr>
-          <w:rFonts w:ascii="Times New Roman" w:eastAsia="Times New Roman" w:hAnsi="Times New Roman" w:cs="Times New Roman"/>
+          <w:rFonts w:ascii="Times New Roman" w:hAnsi="Times New Roman" w:cs="Times New Roman" w:eastAsia="Times New Roman"/>
+          <w:sz w:val="24"/>
         </w:rPr>
         <w:t>User Management &amp; Authentication:</w:t>
-      </w:r>
-      <w:r>
-        <w:rPr>
-          <w:rFonts w:ascii="Times New Roman" w:eastAsia="Times New Roman" w:hAnsi="Times New Roman" w:cs="Times New Roman"/>
-        </w:rPr>
         <w:br/>
         <w:t>●</w:t>
-      </w:r>
-      <w:r>
-        <w:rPr>
-          <w:rFonts w:ascii="Times New Roman" w:eastAsia="Times New Roman" w:hAnsi="Times New Roman" w:cs="Times New Roman"/>
-        </w:rPr>
         <w:tab/>
-        <w:t>Register, verify identity, and manage payout banking details.</w:t>
-      </w:r>
-      <w:r>
-        <w:rPr>
-          <w:rFonts w:ascii="Times New Roman" w:eastAsia="Times New Roman" w:hAnsi="Times New Roman" w:cs="Times New Roman"/>
-        </w:rPr>
+        <w:t>Register, authenticate, and manage multi-role accounts (Admin, System Manager, Shop Manager, Collaborator, Customer) with secure password hashing.</w:t>
         <w:br/>
         <w:t>●</w:t>
-      </w:r>
-      <w:r>
-        <w:rPr>
-          <w:rFonts w:ascii="Times New Roman" w:eastAsia="Times New Roman" w:hAnsi="Times New Roman" w:cs="Times New Roman"/>
-        </w:rPr>
         <w:tab/>
-        <w:t>Secure login using JSON Web Tokens (JWT) and role assignment.</w:t>
-      </w:r>
-      <w:r>
-        <w:rPr>
-          <w:rFonts w:ascii="Times New Roman" w:eastAsia="Times New Roman" w:hAnsi="Times New Roman" w:cs="Times New Roman"/>
-        </w:rPr>
+        <w:t>Secure login using JSON Web Tokens (JWT Access/Refresh token rotation), 2-Factor Authentication (OTP), and multi-level e-KYC submission/audit workflows.</w:t>
         <w:br/>
         <w:t>Attribution &amp; Tracking System:</w:t>
-      </w:r>
-      <w:r>
-        <w:rPr>
-          <w:rFonts w:ascii="Times New Roman" w:eastAsia="Times New Roman" w:hAnsi="Times New Roman" w:cs="Times New Roman"/>
-        </w:rPr>
         <w:br/>
         <w:t>●</w:t>
-      </w:r>
-      <w:r>
-        <w:rPr>
-          <w:rFonts w:ascii="Times New Roman" w:eastAsia="Times New Roman" w:hAnsi="Times New Roman" w:cs="Times New Roman"/>
-        </w:rPr>
         <w:tab/>
-        <w:t>Generate referral links, custom coupon codes, and QR codes associated with collaborator IDs.</w:t>
-      </w:r>
-      <w:r>
-        <w:rPr>
-          <w:rFonts w:ascii="Times New Roman" w:eastAsia="Times New Roman" w:hAnsi="Times New Roman" w:cs="Times New Roman"/>
-        </w:rPr>
+        <w:t>Generate encrypted referral links, custom collaborator coupon codes, and dynamic QR codes.</w:t>
         <w:br/>
         <w:t>●</w:t>
-      </w:r>
-      <w:r>
-        <w:rPr>
-          <w:rFonts w:ascii="Times New Roman" w:eastAsia="Times New Roman" w:hAnsi="Times New Roman" w:cs="Times New Roman"/>
-        </w:rPr>
         <w:tab/>
-        <w:t>Log click traffic and tracking parameters from various marketing channels.</w:t>
-      </w:r>
-      <w:r>
-        <w:rPr>
-          <w:rFonts w:ascii="Times New Roman" w:eastAsia="Times New Roman" w:hAnsi="Times New Roman" w:cs="Times New Roman"/>
-        </w:rPr>
+        <w:t>Log click traffic and tracking parameters from various marketing channels with rate-limiting (anti-click spam) and cookie-based Last-Click attribution.</w:t>
         <w:br/>
-        <w:t>Order &amp; Sales Management:</w:t>
-      </w:r>
-      <w:r>
-        <w:rPr>
-          <w:rFonts w:ascii="Times New Roman" w:eastAsia="Times New Roman" w:hAnsi="Times New Roman" w:cs="Times New Roman"/>
-        </w:rPr>
+        <w:t>Order, Reverse Logistics &amp; Customer Management:</w:t>
         <w:br/>
         <w:t>●</w:t>
-      </w:r>
-      <w:r>
-        <w:rPr>
-          <w:rFonts w:ascii="Times New Roman" w:eastAsia="Times New Roman" w:hAnsi="Times New Roman" w:cs="Times New Roman"/>
-        </w:rPr>
         <w:tab/>
-        <w:t>Synchronize orders from online shopping carts.</w:t>
-      </w:r>
-      <w:r>
-        <w:rPr>
-          <w:rFonts w:ascii="Times New Roman" w:eastAsia="Times New Roman" w:hAnsi="Times New Roman" w:cs="Times New Roman"/>
-        </w:rPr>
+        <w:t>Authenticated customer checkout, address management, and shopping cart order processing.</w:t>
         <w:br/>
         <w:t>●</w:t>
-      </w:r>
-      <w:r>
-        <w:rPr>
-          <w:rFonts w:ascii="Times New Roman" w:eastAsia="Times New Roman" w:hAnsi="Times New Roman" w:cs="Times New Roman"/>
-        </w:rPr>
         <w:tab/>
-        <w:t>Attribute orders to collaborators based on the Last-Click Attribution model.</w:t>
-      </w:r>
-      <w:r>
-        <w:rPr>
-          <w:rFonts w:ascii="Times New Roman" w:eastAsia="Times New Roman" w:hAnsi="Times New Roman" w:cs="Times New Roman"/>
-        </w:rPr>
+        <w:t>Manage order lifecycles: Pending -&gt; Shipping -&gt; Delivered -&gt; Completed (or Cancelled/Returned).</w:t>
         <w:br/>
         <w:t>●</w:t>
-      </w:r>
-      <w:r>
-        <w:rPr>
-          <w:rFonts w:ascii="Times New Roman" w:eastAsia="Times New Roman" w:hAnsi="Times New Roman" w:cs="Times New Roman"/>
-        </w:rPr>
         <w:tab/>
-        <w:t>Manage order lifecycles: Pending -&gt; Shipping -&gt; Delivered -&gt; Completed (or Cancelled/Returned).</w:t>
-      </w:r>
-      <w:r>
-        <w:rPr>
-          <w:rFonts w:ascii="Times New Roman" w:eastAsia="Times New Roman" w:hAnsi="Times New Roman" w:cs="Times New Roman"/>
-        </w:rPr>
+        <w:t>Customer return/refund request workflow, evidence upload, carrier return pickup booking, and platform manager dispute arbitration with automated wallet refund.</w:t>
         <w:br/>
-        <w:t>Commission &amp; Payout Management:</w:t>
-      </w:r>
-      <w:r>
-        <w:rPr>
-          <w:rFonts w:ascii="Times New Roman" w:eastAsia="Times New Roman" w:hAnsi="Times New Roman" w:cs="Times New Roman"/>
-        </w:rPr>
+        <w:t>Commission, Escrow &amp; Payout Management:</w:t>
         <w:br/>
         <w:t>●</w:t>
-      </w:r>
-      <w:r>
-        <w:rPr>
-          <w:rFonts w:ascii="Times New Roman" w:eastAsia="Times New Roman" w:hAnsi="Times New Roman" w:cs="Times New Roman"/>
-        </w:rPr>
         <w:tab/>
-        <w:t>Configure commission rules and tiered thresholds.</w:t>
-      </w:r>
-      <w:r>
-        <w:rPr>
-          <w:rFonts w:ascii="Times New Roman" w:eastAsia="Times New Roman" w:hAnsi="Times New Roman" w:cs="Times New Roman"/>
-        </w:rPr>
+        <w:t>Configure commission rules (standard platform rates or custom negotiated rates) and tiered performance thresholds.</w:t>
         <w:br/>
         <w:t>●</w:t>
-      </w:r>
-      <w:r>
-        <w:rPr>
-          <w:rFonts w:ascii="Times New Roman" w:eastAsia="Times New Roman" w:hAnsi="Times New Roman" w:cs="Times New Roman"/>
-        </w:rPr>
         <w:tab/>
-        <w:t>Automatically credit or debit collaborator commission balances based on real-time order updates.</w:t>
-      </w:r>
-      <w:r>
-        <w:rPr>
-          <w:rFonts w:ascii="Times New Roman" w:eastAsia="Times New Roman" w:hAnsi="Times New Roman" w:cs="Times New Roman"/>
-        </w:rPr>
+        <w:t>Escrow maturation engine holding pending commissions during return warranty windows, with automated commission clawback on returns.</w:t>
         <w:br/>
         <w:t>●</w:t>
-      </w:r>
-      <w:r>
-        <w:rPr>
-          <w:rFonts w:ascii="Times New Roman" w:eastAsia="Times New Roman" w:hAnsi="Times New Roman" w:cs="Times New Roman"/>
-        </w:rPr>
         <w:tab/>
-        <w:t>Process payout requests and export bank transfer transaction files.</w:t>
-      </w:r>
-      <w:r>
-        <w:rPr>
-          <w:rFonts w:ascii="Times New Roman" w:eastAsia="Times New Roman" w:hAnsi="Times New Roman" w:cs="Times New Roman"/>
-        </w:rPr>
+        <w:t>Process payout requests with database concurrency locking, statutory tax withholding, and batch payment export.</w:t>
         <w:br/>
-        <w:t>Product &amp; Inventory Management:</w:t>
-      </w:r>
-      <w:r>
-        <w:rPr>
-          <w:rFonts w:ascii="Times New Roman" w:eastAsia="Times New Roman" w:hAnsi="Times New Roman" w:cs="Times New Roman"/>
-        </w:rPr>
+        <w:t>Product, Variant &amp; Inventory Management:</w:t>
         <w:br/>
         <w:t>●</w:t>
-      </w:r>
-      <w:r>
-        <w:rPr>
-          <w:rFonts w:ascii="Times New Roman" w:eastAsia="Times New Roman" w:hAnsi="Times New Roman" w:cs="Times New Roman"/>
-        </w:rPr>
         <w:tab/>
-        <w:t>Manage product catalogs and synchronize real-time stock levels.</w:t>
-      </w:r>
-      <w:r>
-        <w:rPr>
-          <w:rFonts w:ascii="Times New Roman" w:eastAsia="Times New Roman" w:hAnsi="Times New Roman" w:cs="Times New Roman"/>
-        </w:rPr>
+        <w:t>Manage product variant matrices, sub-SKUs, pricing, and synchronize real-time stock levels.</w:t>
         <w:br/>
         <w:t>●</w:t>
-      </w:r>
-      <w:r>
-        <w:rPr>
-          <w:rFonts w:ascii="Times New Roman" w:eastAsia="Times New Roman" w:hAnsi="Times New Roman" w:cs="Times New Roman"/>
-        </w:rPr>
         <w:tab/>
-        <w:t>Upload, manage, and share promotional media assets.</w:t>
-      </w:r>
-      <w:r>
-        <w:rPr>
-          <w:rFonts w:ascii="Times New Roman" w:eastAsia="Times New Roman" w:hAnsi="Times New Roman" w:cs="Times New Roman"/>
-        </w:rPr>
+        <w:t>Upload, manage, and share promotional media assets in a centralized Media Hub with 1-click copy.</w:t>
         <w:br/>
-        <w:t>Reports &amp; Analytics:</w:t>
-      </w:r>
-      <w:r>
-        <w:rPr>
-          <w:rFonts w:ascii="Times New Roman" w:eastAsia="Times New Roman" w:hAnsi="Times New Roman" w:cs="Times New Roman"/>
-        </w:rPr>
+        <w:t>Creator Collaboration, Samples &amp; Live Commerce:</w:t>
         <w:br/>
         <w:t>●</w:t>
-      </w:r>
-      <w:r>
-        <w:rPr>
-          <w:rFonts w:ascii="Times New Roman" w:eastAsia="Times New Roman" w:hAnsi="Times New Roman" w:cs="Times New Roman"/>
-        </w:rPr>
+        <w:tab/>
+        <w:t>In-app real-time chat between Shop and KOL with exclusive campaign invitation cards.</w:t>
+        <w:br/>
+        <w:t>●</w:t>
+        <w:tab/>
+        <w:t>Structured sample product request workflow with shipping tracking numbers and review video verification.</w:t>
+        <w:br/>
+        <w:t>●</w:t>
+        <w:tab/>
+        <w:t>Live streaming session coordination with real-time deal pinning and ended-stream state handling.</w:t>
+        <w:br/>
+        <w:t>AI Engines, Reports &amp; Analytics:</w:t>
+        <w:br/>
+        <w:t>●</w:t>
+        <w:tab/>
+        <w:t>AI-driven KOL product matching and AI traffic fraud detection flagging suspicious conversions.</w:t>
+        <w:br/>
+        <w:t>●</w:t>
         <w:tab/>
         <w:t>Provide interactive charts on sales trends, conversion rates, and revenue.</w:t>
-      </w:r>
-      <w:r>
-        <w:rPr>
-          <w:rFonts w:ascii="Times New Roman" w:eastAsia="Times New Roman" w:hAnsi="Times New Roman" w:cs="Times New Roman"/>
-        </w:rPr>
         <w:br/>
         <w:t>●</w:t>
-      </w:r>
-      <w:r>
-        <w:rPr>
-          <w:rFonts w:ascii="Times New Roman" w:eastAsia="Times New Roman" w:hAnsi="Times New Roman" w:cs="Times New Roman"/>
-        </w:rPr>
         <w:tab/>
-        <w:t>Generate commission payout reports and financial summaries for store managers.</w:t>
+        <w:t>Generate commission payout reports, collaborator leaderboards, and immutable system Audit Logs.</w:t>
       </w:r>
     </w:p>
     <w:p>
@@ -3471,64 +2862,24 @@
       </w:pPr>
       <w:r>
         <w:rPr>
-          <w:rFonts w:ascii="Times New Roman" w:eastAsia="Times New Roman" w:hAnsi="Times New Roman" w:cs="Times New Roman"/>
+          <w:rFonts w:ascii="Times New Roman" w:hAnsi="Times New Roman" w:cs="Times New Roman" w:eastAsia="Times New Roman"/>
+          <w:sz w:val="24"/>
         </w:rPr>
         <w:t>●</w:t>
-      </w:r>
-      <w:r>
-        <w:rPr>
-          <w:rFonts w:ascii="Times New Roman" w:eastAsia="Times New Roman" w:hAnsi="Times New Roman" w:cs="Times New Roman"/>
-        </w:rPr>
         <w:tab/>
-        <w:t>Security: Encrypt personal and financial details at rest and in transit. Adhere to OWASP Top 10 security standards.</w:t>
-      </w:r>
-      <w:r>
-        <w:rPr>
-          <w:rFonts w:ascii="Times New Roman" w:eastAsia="Times New Roman" w:hAnsi="Times New Roman" w:cs="Times New Roman"/>
-        </w:rPr>
+        <w:t>Security: Enforce OWASP Top 10 compliance, secure password hashing, HTTP-only SameSite cookies, JWT validation with RBAC guards, role-isolated endpoints, and encrypted storage of PII and banking data.</w:t>
         <w:br/>
         <w:t>●</w:t>
-      </w:r>
-      <w:r>
-        <w:rPr>
-          <w:rFonts w:ascii="Times New Roman" w:eastAsia="Times New Roman" w:hAnsi="Times New Roman" w:cs="Times New Roman"/>
-        </w:rPr>
         <w:tab/>
-        <w:t>Data Integrity: Enforce ACID transaction compliance in the database to prevent race conditions during concurrent financial balance updates.</w:t>
-      </w:r>
-      <w:r>
-        <w:rPr>
-          <w:rFonts w:ascii="Times New Roman" w:eastAsia="Times New Roman" w:hAnsi="Times New Roman" w:cs="Times New Roman"/>
-        </w:rPr>
+        <w:t>Data Integrity &amp; Concurrency: Enforce strict ACID compliance across all transactions. Apply database row-level locking to eliminate race conditions and negative wallet balances during concurrent payout requests. Maintain an append-only immutable financial audit ledger.</w:t>
         <w:br/>
         <w:t>●</w:t>
-      </w:r>
-      <w:r>
-        <w:rPr>
-          <w:rFonts w:ascii="Times New Roman" w:eastAsia="Times New Roman" w:hAnsi="Times New Roman" w:cs="Times New Roman"/>
-        </w:rPr>
         <w:tab/>
-        <w:t>Performance: Core API response times under 200ms, frontend page load times under 1.5 seconds. Implement Redis caching for product catalog queries and link click tracking.</w:t>
-      </w:r>
-      <w:r>
-        <w:rPr>
-          <w:rFonts w:ascii="Times New Roman" w:eastAsia="Times New Roman" w:hAnsi="Times New Roman" w:cs="Times New Roman"/>
-        </w:rPr>
+        <w:t>Performance: Core REST API response latency under 200ms, frontend page load times under 1.5 seconds. Implement In-Memory caching for active product catalog queries, click tracking redirection, and distributed rate limiting.</w:t>
         <w:br/>
-      </w:r>
-      <w:r>
-        <w:rPr>
-          <w:rFonts w:ascii="Times New Roman" w:eastAsia="Times New Roman" w:hAnsi="Times New Roman" w:cs="Times New Roman"/>
-        </w:rPr>
-        <w:lastRenderedPageBreak/>
         <w:t>●</w:t>
-      </w:r>
-      <w:r>
-        <w:rPr>
-          <w:rFonts w:ascii="Times New Roman" w:eastAsia="Times New Roman" w:hAnsi="Times New Roman" w:cs="Times New Roman"/>
-        </w:rPr>
         <w:tab/>
-        <w:t>Scalability: Design a modular monolithic architecture, optimized to handle thousands of concurrent collaborators and high daily order volumes.</w:t>
+        <w:t>Scalability: Design a modular monolithic architecture powered by NestJS, strictly decoupling domain boundaries, utilizing database connection pooling, and optimized to handle high volumes of concurrent collaborators and daily orders.</w:t>
       </w:r>
     </w:p>
     <w:p>
@@ -3581,51 +2932,30 @@
       </w:pPr>
       <w:r>
         <w:rPr>
-          <w:rFonts w:ascii="Times New Roman" w:eastAsia="Times New Roman" w:hAnsi="Times New Roman" w:cs="Times New Roman"/>
+          <w:rFonts w:ascii="Times New Roman" w:hAnsi="Times New Roman" w:cs="Times New Roman" w:eastAsia="Times New Roman"/>
+          <w:sz w:val="24"/>
         </w:rPr>
         <w:t>Students will apply comprehensive software development methodologies (Agile/Scrum). The project demonstrates advanced understanding of:</w:t>
-      </w:r>
-      <w:r>
-        <w:rPr>
-          <w:rFonts w:ascii="Times New Roman" w:eastAsia="Times New Roman" w:hAnsi="Times New Roman" w:cs="Times New Roman"/>
-        </w:rPr>
         <w:br/>
         <w:t>●</w:t>
-      </w:r>
-      <w:r>
-        <w:rPr>
-          <w:rFonts w:ascii="Times New Roman" w:eastAsia="Times New Roman" w:hAnsi="Times New Roman" w:cs="Times New Roman"/>
-        </w:rPr>
         <w:tab/>
-        <w:t>Backend Web Development (Node.js): Designing and developing a scalable, event-driven API service using NestJS or Express frameworks for asynchronous request handling.</w:t>
-      </w:r>
-      <w:r>
-        <w:rPr>
-          <w:rFonts w:ascii="Times New Roman" w:eastAsia="Times New Roman" w:hAnsi="Times New Roman" w:cs="Times New Roman"/>
-        </w:rPr>
+        <w:t>Scalable Enterprise Backend (Node.js &amp; NestJS): Architecting a domain-driven Modular Monolith with NestJS controllers, services, guards, interceptors, custom decorators, and asynchronous WebSocket gateways for real-time communication.</w:t>
         <w:br/>
         <w:t>●</w:t>
-      </w:r>
-      <w:r>
-        <w:rPr>
-          <w:rFonts w:ascii="Times New Roman" w:eastAsia="Times New Roman" w:hAnsi="Times New Roman" w:cs="Times New Roman"/>
-        </w:rPr>
         <w:tab/>
-        <w:t>Relational Database Management (PostgreSQL): Designing normal form relational schemas, implementing indexing strategies, and utilizing database transactions to guarantee data consistency for financial ledgers. Leveraging JSONB fields for dynamic product attribute storage.</w:t>
-      </w:r>
-      <w:r>
-        <w:rPr>
-          <w:rFonts w:ascii="Times New Roman" w:eastAsia="Times New Roman" w:hAnsi="Times New Roman" w:cs="Times New Roman"/>
-        </w:rPr>
+        <w:t>Relational Database Design &amp; Concurrency (PostgreSQL &amp; Prisma ORM): Designing a normalized 3NF relational schema, leveraging indexed foreign keys, database transactions, row-level locking for financial integrity, and JSONB fields for dynamic product attribute storage.</w:t>
         <w:br/>
         <w:t>●</w:t>
-      </w:r>
-      <w:r>
-        <w:rPr>
-          <w:rFonts w:ascii="Times New Roman" w:eastAsia="Times New Roman" w:hAnsi="Times New Roman" w:cs="Times New Roman"/>
-        </w:rPr>
         <w:tab/>
-        <w:t>Security &amp; Financial Auditing: Implementing robust logging (audit logs), role-based middleware guards, and cryptographic security to protect financial balances.</w:t>
+        <w:t>In-Memory Caching &amp; Distributed Controls (Redis): Implementing high-throughput click tracking, token management, and distributed rate limiting to neutralize DDoS and click-farming attacks.</w:t>
+        <w:br/>
+        <w:t>●</w:t>
+        <w:tab/>
+        <w:t>Security Engineering &amp; Financial Auditing: Implementing dual-token authentication (JWT + 2FA), cryptographic signature verification, role-based authorization guards, immutable audit trails, and automated tax withholding workflows.</w:t>
+        <w:br/>
+        <w:t>●</w:t>
+        <w:tab/>
+        <w:t>Intelligent Analytics &amp; Heuristics: Implementing recommendation algorithms for creator-product matchmaking and rule-based anomaly detection engines for traffic fraud mitigation.</w:t>
       </w:r>
     </w:p>
     <w:p>
@@ -3659,72 +2989,32 @@
       </w:pPr>
       <w:r>
         <w:rPr>
-          <w:rFonts w:ascii="Times New Roman" w:eastAsia="Times New Roman" w:hAnsi="Times New Roman" w:cs="Times New Roman"/>
+          <w:rFonts w:ascii="Times New Roman" w:hAnsi="Times New Roman" w:cs="Times New Roman" w:eastAsia="Times New Roman"/>
+          <w:sz w:val="24"/>
         </w:rPr>
         <w:t>1.</w:t>
-      </w:r>
-      <w:r>
-        <w:rPr>
-          <w:rFonts w:ascii="Times New Roman" w:eastAsia="Times New Roman" w:hAnsi="Times New Roman" w:cs="Times New Roman"/>
-        </w:rPr>
         <w:tab/>
-        <w:t>Management Web Portal (ReactJS/Next.js): Dashboard for store managers and system administrators to oversee affiliates, configure rules, and audit payouts.</w:t>
-      </w:r>
-      <w:r>
-        <w:rPr>
-          <w:rFonts w:ascii="Times New Roman" w:eastAsia="Times New Roman" w:hAnsi="Times New Roman" w:cs="Times New Roman"/>
-        </w:rPr>
+        <w:t>Administrative &amp; Merchant Web Portal (React + Vite): Modern responsive web application for System Administrators, Platform Managers, and Merchants to supervise KYC, manage product variant matrices, arbitrate return disputes, review performance analytics, and audit batch payouts.</w:t>
         <w:br/>
         <w:t>2.</w:t>
-      </w:r>
-      <w:r>
-        <w:rPr>
-          <w:rFonts w:ascii="Times New Roman" w:eastAsia="Times New Roman" w:hAnsi="Times New Roman" w:cs="Times New Roman"/>
-        </w:rPr>
         <w:tab/>
-        <w:t>Collaborator Web Application (ReactJS/Next.js): Responsive portal optimized for mobile browsers for collaborators to register, retrieve assets, and track commissions.</w:t>
-      </w:r>
-      <w:r>
-        <w:rPr>
-          <w:rFonts w:ascii="Times New Roman" w:eastAsia="Times New Roman" w:hAnsi="Times New Roman" w:cs="Times New Roman"/>
-        </w:rPr>
+        <w:t>Collaborator / Creator Workspace (React + Vite): Mobile-optimized portal for KOLs/KOCs to manage social channels, generate referral links/coupons/QRs, request sample products, chat with brands, and track escrow and withdrawable commissions.</w:t>
         <w:br/>
         <w:t>3.</w:t>
-      </w:r>
-      <w:r>
-        <w:rPr>
-          <w:rFonts w:ascii="Times New Roman" w:eastAsia="Times New Roman" w:hAnsi="Times New Roman" w:cs="Times New Roman"/>
-        </w:rPr>
         <w:tab/>
-        <w:t>Backend API Service (Node.js with NestJS/Express): Powering core business logic, attribution, and database operations.</w:t>
-      </w:r>
-      <w:r>
-        <w:rPr>
-          <w:rFonts w:ascii="Times New Roman" w:eastAsia="Times New Roman" w:hAnsi="Times New Roman" w:cs="Times New Roman"/>
-        </w:rPr>
+        <w:t>Authenticated Customer E-Commerce Experience (React + Vite): Storefront featuring dynamic product catalogs, rich video reviews, authenticated checkout, live carrier order tracking, return/refund disputes, and product reviews.</w:t>
         <w:br/>
         <w:t>4.</w:t>
-      </w:r>
-      <w:r>
-        <w:rPr>
-          <w:rFonts w:ascii="Times New Roman" w:eastAsia="Times New Roman" w:hAnsi="Times New Roman" w:cs="Times New Roman"/>
-        </w:rPr>
         <w:tab/>
-        <w:t>Database System (PostgreSQL &amp; Redis Cache): Secure transactional storage with caching for high-speed read operations.</w:t>
-      </w:r>
-      <w:r>
-        <w:rPr>
-          <w:rFonts w:ascii="Times New Roman" w:eastAsia="Times New Roman" w:hAnsi="Times New Roman" w:cs="Times New Roman"/>
-        </w:rPr>
+        <w:t>Backend API Service (NestJS &amp; Prisma): Comprehensive RESTful API service powering core business modules, WebSocket real-time gateways, escrow cron schedulers, and payment/logistics integrations.</w:t>
         <w:br/>
         <w:t>5.</w:t>
-      </w:r>
-      <w:r>
-        <w:rPr>
-          <w:rFonts w:ascii="Times New Roman" w:eastAsia="Times New Roman" w:hAnsi="Times New Roman" w:cs="Times New Roman"/>
-        </w:rPr>
         <w:tab/>
-        <w:t>Detailed Project Documentation: Software Requirement Specification (SRS) and System Architecture Design (SAD) including ERD, Sequence, and Component diagrams.</w:t>
+        <w:t>High-Performance Database &amp; Cache Infrastructure: PostgreSQL relational database paired with Redis In-Memory cache.</w:t>
+        <w:br/>
+        <w:t>6.</w:t>
+        <w:tab/>
+        <w:t>Complete Engineering Documentation Suite: Software Requirement Specification (SRS), System Architecture Design (SAD), Entity Relationship Diagrams (ERD), UML Component &amp; Sequence Diagrams, API Specifications, and Test Execution Runbooks.</w:t>
       </w:r>
     </w:p>
     <w:p>
@@ -3758,58 +3048,28 @@
       </w:pPr>
       <w:r>
         <w:rPr>
-          <w:rFonts w:ascii="Times New Roman" w:eastAsia="Times New Roman" w:hAnsi="Times New Roman" w:cs="Times New Roman"/>
+          <w:rFonts w:ascii="Times New Roman" w:hAnsi="Times New Roman" w:cs="Times New Roman" w:eastAsia="Times New Roman"/>
+          <w:sz w:val="24"/>
         </w:rPr>
         <w:t>●</w:t>
-      </w:r>
-      <w:r>
-        <w:rPr>
-          <w:rFonts w:ascii="Times New Roman" w:eastAsia="Times New Roman" w:hAnsi="Times New Roman" w:cs="Times New Roman"/>
-        </w:rPr>
         <w:tab/>
-        <w:t>User Requirement Specification (URS): Analyze affiliate marketing workflows, commission payouts, and user personas.</w:t>
-      </w:r>
-      <w:r>
-        <w:rPr>
-          <w:rFonts w:ascii="Times New Roman" w:eastAsia="Times New Roman" w:hAnsi="Times New Roman" w:cs="Times New Roman"/>
-        </w:rPr>
+        <w:t>User &amp; Business Requirement Engineering (URS/SRS): Specify detailed user personas across 5 roles, detail functional requirements, and establish business logic for escrow hold, commission clawback, and tax withholding.</w:t>
         <w:br/>
         <w:t>●</w:t>
-      </w:r>
-      <w:r>
-        <w:rPr>
-          <w:rFonts w:ascii="Times New Roman" w:eastAsia="Times New Roman" w:hAnsi="Times New Roman" w:cs="Times New Roman"/>
-        </w:rPr>
         <w:tab/>
-        <w:t>Software Requirement Specification (SRS): Detail functional requirements, security policies, and performance constraints.</w:t>
-      </w:r>
-      <w:r>
-        <w:rPr>
-          <w:rFonts w:ascii="Times New Roman" w:eastAsia="Times New Roman" w:hAnsi="Times New Roman" w:cs="Times New Roman"/>
-        </w:rPr>
+        <w:t>System Architecture &amp; Database Modeling (SAD): Construct normalized relational schemas in PostgreSQL, define finite state machines for orders, returns, sample requests, and commission states, and document API contracts.</w:t>
         <w:br/>
         <w:t>●</w:t>
-      </w:r>
-      <w:r>
-        <w:rPr>
-          <w:rFonts w:ascii="Times New Roman" w:eastAsia="Times New Roman" w:hAnsi="Times New Roman" w:cs="Times New Roman"/>
-        </w:rPr>
         <w:tab/>
-        <w:t>System Architecture Design (SAD): Design relational database schemas (PostgreSQL ERD), system components, and sequence diagrams for commission attribution.</w:t>
-      </w:r>
-      <w:r>
-        <w:rPr>
-          <w:rFonts w:ascii="Times New Roman" w:eastAsia="Times New Roman" w:hAnsi="Times New Roman" w:cs="Times New Roman"/>
-        </w:rPr>
+        <w:t>Backend Core &amp; Module Implementation: Set up NestJS modular architecture, implement database migrations and seed scripts, integrate Redis rate-limiting, build WebSocket chat gateways, and develop automated escrow cron workers.</w:t>
         <w:br/>
         <w:t>●</w:t>
-      </w:r>
-      <w:r>
-        <w:rPr>
-          <w:rFonts w:ascii="Times New Roman" w:eastAsia="Times New Roman" w:hAnsi="Times New Roman" w:cs="Times New Roman"/>
-        </w:rPr>
         <w:tab/>
-        <w:t>Database &amp; API Implementation: Set up PostgreSQL database migrations, implement Node.js API services, and run automated unit tests.</w:t>
+        <w:t>Frontend Development &amp; Design System Implementation: Build responsive interfaces using React and Vite, implementing interactive analytics dashboards and unified design tokens.</w:t>
+        <w:br/>
+        <w:t>●</w:t>
+        <w:tab/>
+        <w:t>Integration, Security Hardening &amp; Concurrency Verification: Integrate payment and carrier logistics sandbox environments; execute automated concurrency tests verifying row-level locks on wallet withdrawals; conduct end-to-end testing across operational business flows.</w:t>
       </w:r>
     </w:p>
     <w:p>

</xml_diff>